<commit_message>
finish witch with acess point
</commit_message>
<xml_diff>
--- a/001 - estudo pessoal/008 - conexao wireless com ponto de acesso/Manual Passo a Passo Conexao wireless com ponto de acesso.docx
+++ b/001 - estudo pessoal/008 - conexao wireless com ponto de acesso/Manual Passo a Passo Conexao wireless com ponto de acesso.docx
@@ -597,6 +597,9 @@
         <w:jc w:val="center"/>
       </w:pPr>
       <w:r>
+        <w:rPr>
+          <w:noProof/>
+        </w:rPr>
         <w:drawing>
           <wp:inline distT="0" distB="0" distL="0" distR="0" wp14:anchorId="14ABFDE7" wp14:editId="236FF030">
             <wp:extent cx="5400040" cy="2833370"/>
@@ -645,6 +648,9 @@
     </w:p>
     <w:p>
       <w:r>
+        <w:rPr>
+          <w:noProof/>
+        </w:rPr>
         <w:drawing>
           <wp:inline distT="0" distB="0" distL="0" distR="0" wp14:anchorId="167A62B0" wp14:editId="278ABE3D">
             <wp:extent cx="5305425" cy="3846183"/>
@@ -693,6 +699,9 @@
     </w:p>
     <w:p>
       <w:r>
+        <w:rPr>
+          <w:noProof/>
+        </w:rPr>
         <w:drawing>
           <wp:inline distT="0" distB="0" distL="0" distR="0" wp14:anchorId="3EF24823" wp14:editId="08D2152B">
             <wp:extent cx="5400040" cy="3181350"/>
@@ -744,6 +753,9 @@
     </w:p>
     <w:p>
       <w:r>
+        <w:rPr>
+          <w:noProof/>
+        </w:rPr>
         <w:drawing>
           <wp:inline distT="0" distB="0" distL="0" distR="0" wp14:anchorId="101A2FA5" wp14:editId="1875C260">
             <wp:extent cx="5400040" cy="2282190"/>
@@ -797,6 +809,9 @@
     </w:p>
     <w:p>
       <w:r>
+        <w:rPr>
+          <w:noProof/>
+        </w:rPr>
         <w:drawing>
           <wp:inline distT="0" distB="0" distL="0" distR="0" wp14:anchorId="58AFCA09" wp14:editId="6AE6A285">
             <wp:extent cx="3867690" cy="3743847"/>
@@ -862,6 +877,9 @@
         <w:jc w:val="center"/>
       </w:pPr>
       <w:r>
+        <w:rPr>
+          <w:noProof/>
+        </w:rPr>
         <w:drawing>
           <wp:inline distT="0" distB="0" distL="0" distR="0" wp14:anchorId="511E4B26" wp14:editId="563A73EA">
             <wp:extent cx="5400040" cy="4528185"/>
@@ -934,6 +952,9 @@
         <w:jc w:val="center"/>
       </w:pPr>
       <w:r>
+        <w:rPr>
+          <w:noProof/>
+        </w:rPr>
         <w:drawing>
           <wp:inline distT="0" distB="0" distL="0" distR="0" wp14:anchorId="248B542D" wp14:editId="1028F886">
             <wp:extent cx="1991003" cy="4515480"/>
@@ -1003,6 +1024,9 @@
         <w:jc w:val="center"/>
       </w:pPr>
       <w:r>
+        <w:rPr>
+          <w:noProof/>
+        </w:rPr>
         <w:drawing>
           <wp:inline distT="0" distB="0" distL="0" distR="0" wp14:anchorId="5BC54657" wp14:editId="3FEE86F9">
             <wp:extent cx="2695901" cy="3895725"/>
@@ -1046,6 +1070,9 @@
         <w:jc w:val="center"/>
       </w:pPr>
       <w:r>
+        <w:rPr>
+          <w:noProof/>
+        </w:rPr>
         <w:drawing>
           <wp:inline distT="0" distB="0" distL="0" distR="0" wp14:anchorId="5EA71DED" wp14:editId="1AB761C2">
             <wp:extent cx="4116091" cy="3857625"/>
@@ -1089,6 +1116,9 @@
         <w:jc w:val="center"/>
       </w:pPr>
       <w:r>
+        <w:rPr>
+          <w:noProof/>
+        </w:rPr>
         <w:drawing>
           <wp:inline distT="0" distB="0" distL="0" distR="0" wp14:anchorId="2516DAAC" wp14:editId="3A19FD7C">
             <wp:extent cx="2514600" cy="3676809"/>
@@ -1156,6 +1186,9 @@
         <w:jc w:val="center"/>
       </w:pPr>
       <w:r>
+        <w:rPr>
+          <w:noProof/>
+        </w:rPr>
         <w:drawing>
           <wp:inline distT="0" distB="0" distL="0" distR="0" wp14:anchorId="40742E80" wp14:editId="33B4492E">
             <wp:extent cx="4419600" cy="3874946"/>
@@ -1196,6 +1229,9 @@
     <w:p/>
     <w:p>
       <w:r>
+        <w:rPr>
+          <w:noProof/>
+        </w:rPr>
         <w:lastRenderedPageBreak/>
         <w:drawing>
           <wp:inline distT="0" distB="0" distL="0" distR="0" wp14:anchorId="4AB3694E" wp14:editId="37B42D5D">
@@ -1237,6 +1273,9 @@
     <w:p/>
     <w:p>
       <w:r>
+        <w:rPr>
+          <w:noProof/>
+        </w:rPr>
         <w:drawing>
           <wp:inline distT="0" distB="0" distL="0" distR="0" wp14:anchorId="7669C08F" wp14:editId="1F3BB0B8">
             <wp:extent cx="5400040" cy="3497580"/>
@@ -1295,6 +1334,9 @@
         <w:jc w:val="center"/>
       </w:pPr>
       <w:r>
+        <w:rPr>
+          <w:noProof/>
+        </w:rPr>
         <w:drawing>
           <wp:inline distT="0" distB="0" distL="0" distR="0" wp14:anchorId="24A441B7" wp14:editId="30A242A1">
             <wp:extent cx="5400040" cy="2684145"/>
@@ -1335,6 +1377,9 @@
     <w:p/>
     <w:p>
       <w:r>
+        <w:rPr>
+          <w:noProof/>
+        </w:rPr>
         <w:drawing>
           <wp:inline distT="0" distB="0" distL="0" distR="0" wp14:anchorId="106036DF" wp14:editId="3E1FF6E0">
             <wp:extent cx="5400040" cy="2385060"/>
@@ -1375,6 +1420,9 @@
     <w:p/>
     <w:p>
       <w:r>
+        <w:rPr>
+          <w:noProof/>
+        </w:rPr>
         <w:lastRenderedPageBreak/>
         <w:drawing>
           <wp:inline distT="0" distB="0" distL="0" distR="0" wp14:anchorId="4A2FB488" wp14:editId="3D3C313A">
@@ -1416,6 +1464,9 @@
     <w:p/>
     <w:p>
       <w:r>
+        <w:rPr>
+          <w:noProof/>
+        </w:rPr>
         <w:drawing>
           <wp:inline distT="0" distB="0" distL="0" distR="0" wp14:anchorId="5A7593F3" wp14:editId="39483CFA">
             <wp:extent cx="5400040" cy="4626610"/>
@@ -1478,6 +1529,9 @@
         <w:jc w:val="center"/>
       </w:pPr>
       <w:r>
+        <w:rPr>
+          <w:noProof/>
+        </w:rPr>
         <w:drawing>
           <wp:inline distT="0" distB="0" distL="0" distR="0" wp14:anchorId="31EB891D" wp14:editId="33F7E70A">
             <wp:extent cx="4182059" cy="2372056"/>
@@ -1518,6 +1572,9 @@
     <w:p/>
     <w:p>
       <w:r>
+        <w:rPr>
+          <w:noProof/>
+        </w:rPr>
         <w:drawing>
           <wp:inline distT="0" distB="0" distL="0" distR="0" wp14:anchorId="54802417" wp14:editId="52F55DCC">
             <wp:extent cx="4963218" cy="3134162"/>
@@ -1558,6 +1615,9 @@
     <w:p/>
     <w:p>
       <w:r>
+        <w:rPr>
+          <w:noProof/>
+        </w:rPr>
         <w:lastRenderedPageBreak/>
         <w:drawing>
           <wp:inline distT="0" distB="0" distL="0" distR="0" wp14:anchorId="7E78167F" wp14:editId="600401FE">
@@ -1599,6 +1659,9 @@
     <w:p/>
     <w:p>
       <w:r>
+        <w:rPr>
+          <w:noProof/>
+        </w:rPr>
         <w:drawing>
           <wp:inline distT="0" distB="0" distL="0" distR="0" wp14:anchorId="70721ED0" wp14:editId="7486B66F">
             <wp:extent cx="5400040" cy="3004820"/>
@@ -1659,6 +1722,9 @@
     </w:p>
     <w:p>
       <w:r>
+        <w:rPr>
+          <w:noProof/>
+        </w:rPr>
         <w:drawing>
           <wp:inline distT="0" distB="0" distL="0" distR="0" wp14:anchorId="25248E52" wp14:editId="2C8005DE">
             <wp:extent cx="5400040" cy="3271520"/>
@@ -1699,6 +1765,9 @@
     <w:p/>
     <w:p>
       <w:r>
+        <w:rPr>
+          <w:noProof/>
+        </w:rPr>
         <w:drawing>
           <wp:inline distT="0" distB="0" distL="0" distR="0" wp14:anchorId="670E1627" wp14:editId="14A65249">
             <wp:extent cx="5400040" cy="3952875"/>
@@ -1739,6 +1808,9 @@
     <w:p/>
     <w:p>
       <w:r>
+        <w:rPr>
+          <w:noProof/>
+        </w:rPr>
         <w:drawing>
           <wp:inline distT="0" distB="0" distL="0" distR="0" wp14:anchorId="4C3814FA" wp14:editId="25337616">
             <wp:extent cx="5400040" cy="3506470"/>
@@ -1779,6 +1851,9 @@
     <w:p/>
     <w:p>
       <w:r>
+        <w:rPr>
+          <w:noProof/>
+        </w:rPr>
         <w:drawing>
           <wp:inline distT="0" distB="0" distL="0" distR="0" wp14:anchorId="35BDC062" wp14:editId="257D79E5">
             <wp:extent cx="5400040" cy="3860800"/>
@@ -1846,6 +1921,9 @@
         <w:jc w:val="center"/>
       </w:pPr>
       <w:r>
+        <w:rPr>
+          <w:noProof/>
+        </w:rPr>
         <w:drawing>
           <wp:inline distT="0" distB="0" distL="0" distR="0" wp14:anchorId="27F517A1" wp14:editId="3DF4D9CE">
             <wp:extent cx="5400040" cy="2964180"/>
@@ -1889,6 +1967,9 @@
         <w:jc w:val="center"/>
       </w:pPr>
       <w:r>
+        <w:rPr>
+          <w:noProof/>
+        </w:rPr>
         <w:lastRenderedPageBreak/>
         <w:drawing>
           <wp:inline distT="0" distB="0" distL="0" distR="0" wp14:anchorId="7CB229DE" wp14:editId="4F5A3CB8">
@@ -1933,6 +2014,9 @@
         <w:jc w:val="center"/>
       </w:pPr>
       <w:r>
+        <w:rPr>
+          <w:noProof/>
+        </w:rPr>
         <w:drawing>
           <wp:inline distT="0" distB="0" distL="0" distR="0" wp14:anchorId="53262988" wp14:editId="3F207AC0">
             <wp:extent cx="4535271" cy="3267075"/>
@@ -1975,6 +2059,9 @@
     <w:p/>
     <w:p>
       <w:r>
+        <w:rPr>
+          <w:noProof/>
+        </w:rPr>
         <w:drawing>
           <wp:inline distT="0" distB="0" distL="0" distR="0" wp14:anchorId="5EDBE29A" wp14:editId="2B219DBB">
             <wp:extent cx="5400040" cy="3213735"/>
@@ -2026,6 +2113,9 @@
     </w:p>
     <w:p>
       <w:r>
+        <w:rPr>
+          <w:noProof/>
+        </w:rPr>
         <w:drawing>
           <wp:inline distT="0" distB="0" distL="0" distR="0" wp14:anchorId="5AF5BA77" wp14:editId="1FFF3E26">
             <wp:extent cx="4810796" cy="3496163"/>
@@ -2068,6 +2158,9 @@
     <w:p/>
     <w:p>
       <w:r>
+        <w:rPr>
+          <w:noProof/>
+        </w:rPr>
         <w:drawing>
           <wp:inline distT="0" distB="0" distL="0" distR="0" wp14:anchorId="7724FC9F" wp14:editId="397B332D">
             <wp:extent cx="5400040" cy="2406015"/>
@@ -2108,6 +2201,9 @@
     <w:p/>
     <w:p>
       <w:r>
+        <w:rPr>
+          <w:noProof/>
+        </w:rPr>
         <w:drawing>
           <wp:inline distT="0" distB="0" distL="0" distR="0" wp14:anchorId="79784965" wp14:editId="2A037D60">
             <wp:extent cx="5400040" cy="1651000"/>
@@ -2166,23 +2262,44 @@
         <w:t xml:space="preserve"> e para o celular </w:t>
       </w:r>
       <w:r>
-        <w:t>para o pleno funcionamento dos dois na rede. No Computador iremos usar o IP 192.168.1.10</w:t>
+        <w:t xml:space="preserve">para o pleno funcionamento dos </w:t>
+      </w:r>
+      <w:r>
+        <w:t>3</w:t>
+      </w:r>
+      <w:r>
+        <w:t xml:space="preserve"> na rede. No Computador iremos usar o IP 192.168.1.10</w:t>
       </w:r>
       <w:r>
         <w:t>,</w:t>
       </w:r>
       <w:r>
-        <w:t xml:space="preserve"> no notebook sera o IP  . Para colocar os Ips usaremos o caminho de antes, Menu -&gt; Desktop -&gt; IP config</w:t>
+        <w:t xml:space="preserve"> no notebook sera o IP </w:t>
+      </w:r>
+      <w:r>
+        <w:t>192.168.1.11 e no celular sera o IP 192.168.1.12</w:t>
+      </w:r>
+      <w:r>
+        <w:t xml:space="preserve"> . Para colocar os Ips usaremos o caminho de antes, Menu -&gt; Desktop -&gt; IP config</w:t>
       </w:r>
       <w:r>
         <w:t>uration</w:t>
       </w:r>
       <w:r>
-        <w:t xml:space="preserve"> em ambos. </w:t>
-      </w:r>
-    </w:p>
-    <w:p>
-      <w:r>
+        <w:t xml:space="preserve"> em </w:t>
+      </w:r>
+      <w:r>
+        <w:t>todos os 3</w:t>
+      </w:r>
+      <w:r>
+        <w:t xml:space="preserve">. </w:t>
+      </w:r>
+    </w:p>
+    <w:p>
+      <w:r>
+        <w:rPr>
+          <w:noProof/>
+        </w:rPr>
         <w:drawing>
           <wp:inline distT="0" distB="0" distL="0" distR="0" wp14:anchorId="0983F0D4" wp14:editId="6097D6AF">
             <wp:extent cx="5400040" cy="2304415"/>
@@ -2223,6 +2340,9 @@
     <w:p/>
     <w:p>
       <w:r>
+        <w:rPr>
+          <w:noProof/>
+        </w:rPr>
         <w:drawing>
           <wp:inline distT="0" distB="0" distL="0" distR="0" wp14:anchorId="007FCAB6" wp14:editId="318EA2FD">
             <wp:extent cx="5400040" cy="2252980"/>
@@ -2263,6 +2383,9 @@
     <w:p/>
     <w:p>
       <w:r>
+        <w:rPr>
+          <w:noProof/>
+        </w:rPr>
         <w:drawing>
           <wp:inline distT="0" distB="0" distL="0" distR="0" wp14:anchorId="1CD24CDC" wp14:editId="33A4864F">
             <wp:extent cx="5400040" cy="2203450"/>
@@ -2300,9 +2423,67 @@
         </w:drawing>
       </w:r>
     </w:p>
-    <w:p>
-      <w:r>
-        <w:t xml:space="preserve">16 – </w:t>
+    <w:p/>
+    <w:p/>
+    <w:p/>
+    <w:p/>
+    <w:p/>
+    <w:p/>
+    <w:p/>
+    <w:p/>
+    <w:p/>
+    <w:p/>
+    <w:p/>
+    <w:p/>
+    <w:p>
+      <w:r>
+        <w:lastRenderedPageBreak/>
+        <w:t>16 –</w:t>
+      </w:r>
+      <w:r>
+        <w:t xml:space="preserve"> Apos isso sera apenas necessario realizar </w:t>
+      </w:r>
+      <w:r>
+        <w:t>os cenarios de testes. Um deles sera mandar um ping do computador para o celular. Dara sucesso</w:t>
+      </w:r>
+    </w:p>
+    <w:p>
+      <w:r>
+        <w:drawing>
+          <wp:inline distT="0" distB="0" distL="0" distR="0" wp14:anchorId="2A0988F3" wp14:editId="4AD79B8F">
+            <wp:extent cx="4496427" cy="3410426"/>
+            <wp:effectExtent l="0" t="0" r="0" b="0"/>
+            <wp:docPr id="2073614596" name="Picture 1"/>
+            <wp:cNvGraphicFramePr>
+              <a:graphicFrameLocks xmlns:a="http://schemas.openxmlformats.org/drawingml/2006/main" noChangeAspect="1"/>
+            </wp:cNvGraphicFramePr>
+            <a:graphic xmlns:a="http://schemas.openxmlformats.org/drawingml/2006/main">
+              <a:graphicData uri="http://schemas.openxmlformats.org/drawingml/2006/picture">
+                <pic:pic xmlns:pic="http://schemas.openxmlformats.org/drawingml/2006/picture">
+                  <pic:nvPicPr>
+                    <pic:cNvPr id="2073614596" name=""/>
+                    <pic:cNvPicPr/>
+                  </pic:nvPicPr>
+                  <pic:blipFill>
+                    <a:blip r:embed="rId41"/>
+                    <a:stretch>
+                      <a:fillRect/>
+                    </a:stretch>
+                  </pic:blipFill>
+                  <pic:spPr>
+                    <a:xfrm>
+                      <a:off x="0" y="0"/>
+                      <a:ext cx="4496427" cy="3410426"/>
+                    </a:xfrm>
+                    <a:prstGeom prst="rect">
+                      <a:avLst/>
+                    </a:prstGeom>
+                  </pic:spPr>
+                </pic:pic>
+              </a:graphicData>
+            </a:graphic>
+          </wp:inline>
+        </w:drawing>
       </w:r>
     </w:p>
     <w:p/>
@@ -2310,6 +2491,169 @@
       <w:r>
         <w:t xml:space="preserve">17 – </w:t>
       </w:r>
+      <w:r>
+        <w:t>Agora sera necessario o teste de pacote e mensageria</w:t>
+      </w:r>
+    </w:p>
+    <w:p>
+      <w:r>
+        <w:drawing>
+          <wp:inline distT="0" distB="0" distL="0" distR="0" wp14:anchorId="24924903" wp14:editId="1B07B469">
+            <wp:extent cx="3629532" cy="3048425"/>
+            <wp:effectExtent l="0" t="0" r="9525" b="0"/>
+            <wp:docPr id="81902741" name="Picture 1"/>
+            <wp:cNvGraphicFramePr>
+              <a:graphicFrameLocks xmlns:a="http://schemas.openxmlformats.org/drawingml/2006/main" noChangeAspect="1"/>
+            </wp:cNvGraphicFramePr>
+            <a:graphic xmlns:a="http://schemas.openxmlformats.org/drawingml/2006/main">
+              <a:graphicData uri="http://schemas.openxmlformats.org/drawingml/2006/picture">
+                <pic:pic xmlns:pic="http://schemas.openxmlformats.org/drawingml/2006/picture">
+                  <pic:nvPicPr>
+                    <pic:cNvPr id="81902741" name=""/>
+                    <pic:cNvPicPr/>
+                  </pic:nvPicPr>
+                  <pic:blipFill>
+                    <a:blip r:embed="rId42"/>
+                    <a:stretch>
+                      <a:fillRect/>
+                    </a:stretch>
+                  </pic:blipFill>
+                  <pic:spPr>
+                    <a:xfrm>
+                      <a:off x="0" y="0"/>
+                      <a:ext cx="3629532" cy="3048425"/>
+                    </a:xfrm>
+                    <a:prstGeom prst="rect">
+                      <a:avLst/>
+                    </a:prstGeom>
+                  </pic:spPr>
+                </pic:pic>
+              </a:graphicData>
+            </a:graphic>
+          </wp:inline>
+        </w:drawing>
+      </w:r>
+    </w:p>
+    <w:p/>
+    <w:p>
+      <w:r>
+        <w:lastRenderedPageBreak/>
+        <w:drawing>
+          <wp:inline distT="0" distB="0" distL="0" distR="0" wp14:anchorId="2BDC3EB7" wp14:editId="3B5EAD26">
+            <wp:extent cx="3315163" cy="2867425"/>
+            <wp:effectExtent l="0" t="0" r="0" b="9525"/>
+            <wp:docPr id="2091469468" name="Picture 1"/>
+            <wp:cNvGraphicFramePr>
+              <a:graphicFrameLocks xmlns:a="http://schemas.openxmlformats.org/drawingml/2006/main" noChangeAspect="1"/>
+            </wp:cNvGraphicFramePr>
+            <a:graphic xmlns:a="http://schemas.openxmlformats.org/drawingml/2006/main">
+              <a:graphicData uri="http://schemas.openxmlformats.org/drawingml/2006/picture">
+                <pic:pic xmlns:pic="http://schemas.openxmlformats.org/drawingml/2006/picture">
+                  <pic:nvPicPr>
+                    <pic:cNvPr id="2091469468" name=""/>
+                    <pic:cNvPicPr/>
+                  </pic:nvPicPr>
+                  <pic:blipFill>
+                    <a:blip r:embed="rId43"/>
+                    <a:stretch>
+                      <a:fillRect/>
+                    </a:stretch>
+                  </pic:blipFill>
+                  <pic:spPr>
+                    <a:xfrm>
+                      <a:off x="0" y="0"/>
+                      <a:ext cx="3315163" cy="2867425"/>
+                    </a:xfrm>
+                    <a:prstGeom prst="rect">
+                      <a:avLst/>
+                    </a:prstGeom>
+                  </pic:spPr>
+                </pic:pic>
+              </a:graphicData>
+            </a:graphic>
+          </wp:inline>
+        </w:drawing>
+      </w:r>
+    </w:p>
+    <w:p/>
+    <w:p>
+      <w:r>
+        <w:drawing>
+          <wp:inline distT="0" distB="0" distL="0" distR="0" wp14:anchorId="1D31E359" wp14:editId="1DEB9471">
+            <wp:extent cx="3562847" cy="3191320"/>
+            <wp:effectExtent l="0" t="0" r="0" b="9525"/>
+            <wp:docPr id="1912161274" name="Picture 1"/>
+            <wp:cNvGraphicFramePr>
+              <a:graphicFrameLocks xmlns:a="http://schemas.openxmlformats.org/drawingml/2006/main" noChangeAspect="1"/>
+            </wp:cNvGraphicFramePr>
+            <a:graphic xmlns:a="http://schemas.openxmlformats.org/drawingml/2006/main">
+              <a:graphicData uri="http://schemas.openxmlformats.org/drawingml/2006/picture">
+                <pic:pic xmlns:pic="http://schemas.openxmlformats.org/drawingml/2006/picture">
+                  <pic:nvPicPr>
+                    <pic:cNvPr id="1912161274" name=""/>
+                    <pic:cNvPicPr/>
+                  </pic:nvPicPr>
+                  <pic:blipFill>
+                    <a:blip r:embed="rId44"/>
+                    <a:stretch>
+                      <a:fillRect/>
+                    </a:stretch>
+                  </pic:blipFill>
+                  <pic:spPr>
+                    <a:xfrm>
+                      <a:off x="0" y="0"/>
+                      <a:ext cx="3562847" cy="3191320"/>
+                    </a:xfrm>
+                    <a:prstGeom prst="rect">
+                      <a:avLst/>
+                    </a:prstGeom>
+                  </pic:spPr>
+                </pic:pic>
+              </a:graphicData>
+            </a:graphic>
+          </wp:inline>
+        </w:drawing>
+      </w:r>
+    </w:p>
+    <w:p>
+      <w:r>
+        <w:lastRenderedPageBreak/>
+        <w:drawing>
+          <wp:inline distT="0" distB="0" distL="0" distR="0" wp14:anchorId="7C69AD56" wp14:editId="7D2BC86E">
+            <wp:extent cx="3372321" cy="3134162"/>
+            <wp:effectExtent l="0" t="0" r="0" b="0"/>
+            <wp:docPr id="70757986" name="Picture 1"/>
+            <wp:cNvGraphicFramePr>
+              <a:graphicFrameLocks xmlns:a="http://schemas.openxmlformats.org/drawingml/2006/main" noChangeAspect="1"/>
+            </wp:cNvGraphicFramePr>
+            <a:graphic xmlns:a="http://schemas.openxmlformats.org/drawingml/2006/main">
+              <a:graphicData uri="http://schemas.openxmlformats.org/drawingml/2006/picture">
+                <pic:pic xmlns:pic="http://schemas.openxmlformats.org/drawingml/2006/picture">
+                  <pic:nvPicPr>
+                    <pic:cNvPr id="70757986" name=""/>
+                    <pic:cNvPicPr/>
+                  </pic:nvPicPr>
+                  <pic:blipFill>
+                    <a:blip r:embed="rId45"/>
+                    <a:stretch>
+                      <a:fillRect/>
+                    </a:stretch>
+                  </pic:blipFill>
+                  <pic:spPr>
+                    <a:xfrm>
+                      <a:off x="0" y="0"/>
+                      <a:ext cx="3372321" cy="3134162"/>
+                    </a:xfrm>
+                    <a:prstGeom prst="rect">
+                      <a:avLst/>
+                    </a:prstGeom>
+                  </pic:spPr>
+                </pic:pic>
+              </a:graphicData>
+            </a:graphic>
+          </wp:inline>
+        </w:drawing>
+      </w:r>
     </w:p>
     <w:p/>
     <w:p>
@@ -2346,7 +2690,6 @@
     <w:p/>
     <w:p>
       <w:r>
-        <w:lastRenderedPageBreak/>
         <w:t xml:space="preserve">22 – </w:t>
       </w:r>
     </w:p>

</xml_diff>